<commit_message>
SMS and MMS sending: provider-independent engine, sandbox text engine, STOP handling, quiet hours, replies
Text campaigns run through the same send engine as email: SmsProvider adapter contract, number-based audience
with a suppression reason for everyone left out, at-most-once dispatch into sms_execution, delivery receipts,
inbound replies (STOP / START / HELP) with number blocking, quiet hours for marketing texts, message parts in
the report, text senders and engines in Settings, replies on the campaign page. A sandbox engine that sends
nothing is installed; the Digivize adapter is an unregistered skeleton until its API specification is available.

Co-Authored-By: Claude Fable 5.1 <noreply@anthropic.com>
</commit_message>
<xml_diff>
--- a/docs/CEP_Deployment_Guide.docx
+++ b/docs/CEP_Deployment_Guide.docx
@@ -43,7 +43,7 @@
           <w:sz w:val="21"/>
           <w:szCs w:val="21"/>
         </w:rPr>
-        <w:t xml:space="preserve">Version 1.1  ·  18 September 2026  ·  Repository: github.com/Git-aiintelekt/CEP (branch main)</w:t>
+        <w:t xml:space="preserve">Version 1.2  ·  18 September 2026  ·  Repository: github.com/Git-aiintelekt/CEP (branch main)</w:t>
       </w:r>
     </w:p>
     <w:p>
@@ -749,7 +749,7 @@
                 <w:sz w:val="21"/>
                 <w:szCs w:val="21"/>
               </w:rPr>
-              <w:t xml:space="preserve">Background jobs: campaign sending (runs and email batches), event outbox relay, partition maintenance, usage rollup, alerts, invoices, tenant operations. Queues: </w:t>
+              <w:t xml:space="preserve">Background jobs: campaign sending (runs, email and text batches), event outbox relay, partition maintenance, usage rollup, alerts, invoices, tenant operations. Queues: </w:t>
             </w:r>
             <w:r>
               <w:rPr>
@@ -759,7 +759,7 @@
                 <w:szCs w:val="19"/>
                 <w:shd w:fill="EEF2F7" w:val="clear"/>
               </w:rPr>
-              <w:t xml:space="preserve">default,events,maintenance,campaign,email</w:t>
+              <w:t xml:space="preserve">default,events,maintenance,campaign,email,sms</w:t>
             </w:r>
             <w:r>
               <w:rPr>
@@ -6906,7 +6906,7 @@
           <w:sz w:val="17"/>
           <w:szCs w:val="17"/>
         </w:rPr>
-        <w:t xml:space="preserve">          -Q default,events,maintenance,campaign,email --concurrency 4 -l INFO \</w:t>
+        <w:t xml:space="preserve">          -Q default,events,maintenance,campaign,email,sms --concurrency 4 -l INFO \</w:t>
       </w:r>
     </w:p>
     <w:p>
@@ -7495,7 +7495,7 @@
           <w:sz w:val="21"/>
           <w:szCs w:val="21"/>
         </w:rPr>
-        <w:t xml:space="preserve">): outbox relay every second, campaign runs every minute (starts due runs, closes finished ones), partitions every 6 hours, retention daily, usage hourly, alerts every 5 minutes, invoices daily, tenant operations every 10 minutes. Campaign email is sent by the </w:t>
+        <w:t xml:space="preserve">): outbox relay every second, campaign runs every minute (starts due runs, closes finished ones), partitions every 6 hours, retention daily, usage hourly, alerts every 5 minutes, invoices daily, tenant operations every 10 minutes. Campaign email and texts are sent by the </w:t>
       </w:r>
       <w:r>
         <w:rPr>
@@ -7514,7 +7514,7 @@
           <w:sz w:val="21"/>
           <w:szCs w:val="21"/>
         </w:rPr>
-        <w:t xml:space="preserve"> and </w:t>
+        <w:t xml:space="preserve">, </w:t>
       </w:r>
       <w:r>
         <w:rPr>
@@ -7525,6 +7525,25 @@
           <w:shd w:fill="EEF2F7" w:val="clear"/>
         </w:rPr>
         <w:t xml:space="preserve">email</w:t>
+      </w:r>
+      <w:r>
+        <w:rPr>
+          <w:rFonts w:ascii="Calibri" w:cs="Calibri" w:eastAsia="Calibri" w:hAnsi="Calibri"/>
+          <w:color w:val="1F2937"/>
+          <w:sz w:val="21"/>
+          <w:szCs w:val="21"/>
+        </w:rPr>
+        <w:t xml:space="preserve"> and </w:t>
+      </w:r>
+      <w:r>
+        <w:rPr>
+          <w:rFonts w:ascii="Consolas" w:cs="Consolas" w:eastAsia="Consolas" w:hAnsi="Consolas"/>
+          <w:color w:val="0F172A"/>
+          <w:sz w:val="19"/>
+          <w:szCs w:val="19"/>
+          <w:shd w:fill="EEF2F7" w:val="clear"/>
+        </w:rPr>
+        <w:t xml:space="preserve">sms</w:t>
       </w:r>
       <w:r>
         <w:rPr>
@@ -12708,7 +12727,7 @@
                 <w:sz w:val="21"/>
                 <w:szCs w:val="21"/>
               </w:rPr>
-              <w:t xml:space="preserve"> and </w:t>
+              <w:t xml:space="preserve">, </w:t>
             </w:r>
             <w:r>
               <w:rPr>
@@ -12719,6 +12738,25 @@
                 <w:shd w:fill="EEF2F7" w:val="clear"/>
               </w:rPr>
               <w:t xml:space="preserve">email</w:t>
+            </w:r>
+            <w:r>
+              <w:rPr>
+                <w:rFonts w:ascii="Calibri" w:cs="Calibri" w:eastAsia="Calibri" w:hAnsi="Calibri"/>
+                <w:color w:val="1F2937"/>
+                <w:sz w:val="21"/>
+                <w:szCs w:val="21"/>
+              </w:rPr>
+              <w:t xml:space="preserve"> and </w:t>
+            </w:r>
+            <w:r>
+              <w:rPr>
+                <w:rFonts w:ascii="Consolas" w:cs="Consolas" w:eastAsia="Consolas" w:hAnsi="Consolas"/>
+                <w:color w:val="0F172A"/>
+                <w:sz w:val="19"/>
+                <w:szCs w:val="19"/>
+                <w:shd w:fill="EEF2F7" w:val="clear"/>
+              </w:rPr>
+              <w:t xml:space="preserve">sms</w:t>
             </w:r>
             <w:r>
               <w:rPr>

</xml_diff>

<commit_message>
Deployment guide v1.4 + a new infrastructure sizing companion doc
Deployment guide: corrects the patch count (0001-0015, with 0016 flagged
local-only), adds a release-status note on what main is missing versus
cep_dev_18_sep_26, and documents the two new idle-timeout global parameters.

New doc answers "how many VMs and how big": three sizing tiers (pilot,
recommended production, high availability) with hardware tables and two
deployment diagrams, grounded in the existing architecture and the guide's
own "scaling out later" section rather than invented numbers.

Co-Authored-By: Claude Sonnet 5 <noreply@anthropic.com>
</commit_message>
<xml_diff>
--- a/docs/CEP_Deployment_Guide.docx
+++ b/docs/CEP_Deployment_Guide.docx
@@ -43,7 +43,7 @@
           <w:sz w:val="21"/>
           <w:szCs w:val="21"/>
         </w:rPr>
-        <w:t xml:space="preserve">Version 1.3  ·  21 September 2026  ·  Repository: github.com/Git-aiintelekt/CEP (branch main)</w:t>
+        <w:t xml:space="preserve">Version 1.4  ·  23 September 2026  ·  Repository: github.com/Git-aiintelekt/CEP (branch main)</w:t>
       </w:r>
     </w:p>
     <w:p>
@@ -127,6 +127,180 @@
           <w:szCs w:val="21"/>
         </w:rPr>
         <w:t xml:space="preserve"> name, path and IP address with your own. No password appears in this document, and none should be added to it.</w:t>
+      </w:r>
+    </w:p>
+    <w:p>
+      <w:pPr>
+        <w:pBdr>
+          <w:left w:val="single" w:color="D97706" w:sz="18" w:space="6"/>
+        </w:pBdr>
+        <w:shd w:fill="FEF3C7" w:val="clear"/>
+        <w:spacing w:after="160" w:before="80" w:line="280"/>
+        <w:ind w:left="120" w:right="120"/>
+      </w:pPr>
+      <w:r>
+        <w:rPr>
+          <w:rFonts w:ascii="Calibri" w:cs="Calibri" w:eastAsia="Calibri" w:hAnsi="Calibri"/>
+          <w:b/>
+          <w:bCs/>
+          <w:color w:val="1F2937"/>
+          <w:sz w:val="21"/>
+          <w:szCs w:val="21"/>
+        </w:rPr>
+        <w:t xml:space="preserve">Release status, 23 September 2026.  </w:t>
+      </w:r>
+      <w:r>
+        <w:rPr>
+          <w:rFonts w:ascii="Consolas" w:cs="Consolas" w:eastAsia="Consolas" w:hAnsi="Consolas"/>
+          <w:color w:val="0F172A"/>
+          <w:sz w:val="19"/>
+          <w:szCs w:val="19"/>
+          <w:shd w:fill="EEF2F7" w:val="clear"/>
+        </w:rPr>
+        <w:t xml:space="preserve">main</w:t>
+      </w:r>
+      <w:r>
+        <w:rPr>
+          <w:rFonts w:ascii="Calibri" w:cs="Calibri" w:eastAsia="Calibri" w:hAnsi="Calibri"/>
+          <w:color w:val="1F2937"/>
+          <w:sz w:val="21"/>
+          <w:szCs w:val="21"/>
+        </w:rPr>
+        <w:t xml:space="preserve"> currently carries the contact list module and the campaign module (list, seven-step setup, campaign page, publish and send). It does </w:t>
+      </w:r>
+      <w:r>
+        <w:rPr>
+          <w:rFonts w:ascii="Calibri" w:cs="Calibri" w:eastAsia="Calibri" w:hAnsi="Calibri"/>
+          <w:b/>
+          <w:bCs/>
+          <w:color w:val="1F2937"/>
+          <w:sz w:val="21"/>
+          <w:szCs w:val="21"/>
+        </w:rPr>
+        <w:t xml:space="preserve">not yet</w:t>
+      </w:r>
+      <w:r>
+        <w:rPr>
+          <w:rFonts w:ascii="Calibri" w:cs="Calibri" w:eastAsia="Calibri" w:hAnsi="Calibri"/>
+          <w:color w:val="1F2937"/>
+          <w:sz w:val="21"/>
+          <w:szCs w:val="21"/>
+        </w:rPr>
+        <w:t xml:space="preserve"> include three finished pieces of work still on branch </w:t>
+      </w:r>
+      <w:r>
+        <w:rPr>
+          <w:rFonts w:ascii="Consolas" w:cs="Consolas" w:eastAsia="Consolas" w:hAnsi="Consolas"/>
+          <w:color w:val="0F172A"/>
+          <w:sz w:val="19"/>
+          <w:szCs w:val="19"/>
+          <w:shd w:fill="EEF2F7" w:val="clear"/>
+        </w:rPr>
+        <w:t xml:space="preserve">cep_dev_18_sep_26</w:t>
+      </w:r>
+      <w:r>
+        <w:rPr>
+          <w:rFonts w:ascii="Calibri" w:cs="Calibri" w:eastAsia="Calibri" w:hAnsi="Calibri"/>
+          <w:color w:val="1F2937"/>
+          <w:sz w:val="21"/>
+          <w:szCs w:val="21"/>
+        </w:rPr>
+        <w:t xml:space="preserve">, pending its pull request into </w:t>
+      </w:r>
+      <w:r>
+        <w:rPr>
+          <w:rFonts w:ascii="Consolas" w:cs="Consolas" w:eastAsia="Consolas" w:hAnsi="Consolas"/>
+          <w:color w:val="0F172A"/>
+          <w:sz w:val="19"/>
+          <w:szCs w:val="19"/>
+          <w:shd w:fill="EEF2F7" w:val="clear"/>
+        </w:rPr>
+        <w:t xml:space="preserve">main</w:t>
+      </w:r>
+      <w:r>
+        <w:rPr>
+          <w:rFonts w:ascii="Calibri" w:cs="Calibri" w:eastAsia="Calibri" w:hAnsi="Calibri"/>
+          <w:color w:val="1F2937"/>
+          <w:sz w:val="21"/>
+          <w:szCs w:val="21"/>
+        </w:rPr>
+        <w:t xml:space="preserve">: the shared UI restyle (the design tokens and component primitives this guide's screenshots do not reflect), the campaign calendar view, and the idle session timeout (section 3.1 and section 10 both note the two settings it adds). Confirm which commit is actually on </w:t>
+      </w:r>
+      <w:r>
+        <w:rPr>
+          <w:rFonts w:ascii="Consolas" w:cs="Consolas" w:eastAsia="Consolas" w:hAnsi="Consolas"/>
+          <w:color w:val="0F172A"/>
+          <w:sz w:val="19"/>
+          <w:szCs w:val="19"/>
+          <w:shd w:fill="EEF2F7" w:val="clear"/>
+        </w:rPr>
+        <w:t xml:space="preserve">main</w:t>
+      </w:r>
+      <w:r>
+        <w:rPr>
+          <w:rFonts w:ascii="Calibri" w:cs="Calibri" w:eastAsia="Calibri" w:hAnsi="Calibri"/>
+          <w:color w:val="1F2937"/>
+          <w:sz w:val="21"/>
+          <w:szCs w:val="21"/>
+        </w:rPr>
+        <w:t xml:space="preserve"> (</w:t>
+      </w:r>
+      <w:r>
+        <w:rPr>
+          <w:rFonts w:ascii="Consolas" w:cs="Consolas" w:eastAsia="Consolas" w:hAnsi="Consolas"/>
+          <w:color w:val="0F172A"/>
+          <w:sz w:val="19"/>
+          <w:szCs w:val="19"/>
+          <w:shd w:fill="EEF2F7" w:val="clear"/>
+        </w:rPr>
+        <w:t xml:space="preserve">git log -1</w:t>
+      </w:r>
+      <w:r>
+        <w:rPr>
+          <w:rFonts w:ascii="Calibri" w:cs="Calibri" w:eastAsia="Calibri" w:hAnsi="Calibri"/>
+          <w:color w:val="1F2937"/>
+          <w:sz w:val="21"/>
+          <w:szCs w:val="21"/>
+        </w:rPr>
+        <w:t xml:space="preserve">) before treating this guide as a description of what a fresh deployment will contain, and prefer deploying </w:t>
+      </w:r>
+      <w:r>
+        <w:rPr>
+          <w:rFonts w:ascii="Consolas" w:cs="Consolas" w:eastAsia="Consolas" w:hAnsi="Consolas"/>
+          <w:color w:val="0F172A"/>
+          <w:sz w:val="19"/>
+          <w:szCs w:val="19"/>
+          <w:shd w:fill="EEF2F7" w:val="clear"/>
+        </w:rPr>
+        <w:t xml:space="preserve">cep_dev_18_sep_26</w:t>
+      </w:r>
+      <w:r>
+        <w:rPr>
+          <w:rFonts w:ascii="Calibri" w:cs="Calibri" w:eastAsia="Calibri" w:hAnsi="Calibri"/>
+          <w:color w:val="1F2937"/>
+          <w:sz w:val="21"/>
+          <w:szCs w:val="21"/>
+        </w:rPr>
+        <w:t xml:space="preserve"> — or </w:t>
+      </w:r>
+      <w:r>
+        <w:rPr>
+          <w:rFonts w:ascii="Consolas" w:cs="Consolas" w:eastAsia="Consolas" w:hAnsi="Consolas"/>
+          <w:color w:val="0F172A"/>
+          <w:sz w:val="19"/>
+          <w:szCs w:val="19"/>
+          <w:shd w:fill="EEF2F7" w:val="clear"/>
+        </w:rPr>
+        <w:t xml:space="preserve">main</w:t>
+      </w:r>
+      <w:r>
+        <w:rPr>
+          <w:rFonts w:ascii="Calibri" w:cs="Calibri" w:eastAsia="Calibri" w:hAnsi="Calibri"/>
+          <w:color w:val="1F2937"/>
+          <w:sz w:val="21"/>
+          <w:szCs w:val="21"/>
+        </w:rPr>
+        <w:t xml:space="preserve"> once that branch is merged — over an older commit.</w:t>
       </w:r>
     </w:p>
     <w:p>
@@ -3233,7 +3407,7 @@
           <w:sz w:val="21"/>
           <w:szCs w:val="21"/>
         </w:rPr>
-        <w:t xml:space="preserve">The schema, all five DDL layers and patches 0001–0008 are already applied to </w:t>
+        <w:t xml:space="preserve">The schema, all five DDL layers and patches 0001–0015 are already applied to </w:t>
       </w:r>
       <w:r>
         <w:rPr>
@@ -3252,7 +3426,7 @@
           <w:sz w:val="21"/>
           <w:szCs w:val="21"/>
         </w:rPr>
-        <w:t xml:space="preserve">, and the three logins exist. Nothing has to be created. Two things to check from the new application server:</w:t>
+        <w:t xml:space="preserve">, and the three logins exist. Patch 0016 (the idle session timeout's two global parameters) is applied locally only as of this version of the guide; apply it as part of the release that brings the frontend change live (section 3.3). Nothing else has to be created. Two things to check from the new application server:</w:t>
       </w:r>
     </w:p>
     <w:p>
@@ -9492,6 +9666,74 @@
           <w:szCs w:val="21"/>
         </w:rPr>
         <w:t xml:space="preserve"> on.</w:t>
+      </w:r>
+    </w:p>
+    <w:p>
+      <w:pPr>
+        <w:pStyle w:val="ListParagraph"/>
+        <w:numPr>
+          <w:ilvl w:val="0"/>
+          <w:numId w:val="4"/>
+        </w:numPr>
+        <w:spacing w:after="80" w:line="280"/>
+      </w:pPr>
+      <w:r>
+        <w:rPr>
+          <w:rFonts w:ascii="Calibri" w:cs="Calibri" w:eastAsia="Calibri" w:hAnsi="Calibri"/>
+          <w:b/>
+          <w:bCs/>
+          <w:color w:val="1F2937"/>
+          <w:sz w:val="21"/>
+          <w:szCs w:val="21"/>
+        </w:rPr>
+        <w:t xml:space="preserve">Idle sign-out (patch 0016 and newer).</w:t>
+      </w:r>
+      <w:r>
+        <w:rPr>
+          <w:rFonts w:ascii="Calibri" w:cs="Calibri" w:eastAsia="Calibri" w:hAnsi="Calibri"/>
+          <w:color w:val="1F2937"/>
+          <w:sz w:val="21"/>
+          <w:szCs w:val="21"/>
+        </w:rPr>
+        <w:t xml:space="preserve"> Configuration → Global parameters: </w:t>
+      </w:r>
+      <w:r>
+        <w:rPr>
+          <w:rFonts w:ascii="Consolas" w:cs="Consolas" w:eastAsia="Consolas" w:hAnsi="Consolas"/>
+          <w:color w:val="0F172A"/>
+          <w:sz w:val="19"/>
+          <w:szCs w:val="19"/>
+          <w:shd w:fill="EEF2F7" w:val="clear"/>
+        </w:rPr>
+        <w:t xml:space="preserve">security.idle_timeout_minutes</w:t>
+      </w:r>
+      <w:r>
+        <w:rPr>
+          <w:rFonts w:ascii="Calibri" w:cs="Calibri" w:eastAsia="Calibri" w:hAnsi="Calibri"/>
+          <w:color w:val="1F2937"/>
+          <w:sz w:val="21"/>
+          <w:szCs w:val="21"/>
+        </w:rPr>
+        <w:t xml:space="preserve"> (default 120) and </w:t>
+      </w:r>
+      <w:r>
+        <w:rPr>
+          <w:rFonts w:ascii="Consolas" w:cs="Consolas" w:eastAsia="Consolas" w:hAnsi="Consolas"/>
+          <w:color w:val="0F172A"/>
+          <w:sz w:val="19"/>
+          <w:szCs w:val="19"/>
+          <w:shd w:fill="EEF2F7" w:val="clear"/>
+        </w:rPr>
+        <w:t xml:space="preserve">security.idle_warning_seconds</w:t>
+      </w:r>
+      <w:r>
+        <w:rPr>
+          <w:rFonts w:ascii="Calibri" w:cs="Calibri" w:eastAsia="Calibri" w:hAnsi="Calibri"/>
+          <w:color w:val="1F2937"/>
+          <w:sz w:val="21"/>
+          <w:szCs w:val="21"/>
+        </w:rPr>
+        <w:t xml:space="preserve"> (default 60) control how long the frontend waits before warning of inactivity, and how long that warning stays up before signing the person out. The defaults suit most workspaces; change them here, not in code.</w:t>
       </w:r>
     </w:p>
     <w:p>

</xml_diff>

<commit_message>
Deployment guide: release-status note and patch level as of 24 September 2026
The 1.5 regeneration still carried the 23 September note saying main lacked
the restyle, calendar and idle timeout, pending their pull request -- PR #12
merged all of it. Now: main is the branch of record, the dev server deploys
from it, patches 0001-0017 are on cep_db and 0018 is the one this release adds.

Co-Authored-By: Claude Fable 5.1 <noreply@anthropic.com>
</commit_message>
<xml_diff>
--- a/docs/CEP_Deployment_Guide.docx
+++ b/docs/CEP_Deployment_Guide.docx
@@ -132,9 +132,9 @@
     <w:p>
       <w:pPr>
         <w:pBdr>
-          <w:left w:val="single" w:color="D97706" w:sz="18" w:space="6"/>
-        </w:pBdr>
-        <w:shd w:fill="FEF3C7" w:val="clear"/>
+          <w:left w:val="single" w:color="059669" w:sz="18" w:space="6"/>
+        </w:pBdr>
+        <w:shd w:fill="ECFDF5" w:val="clear"/>
         <w:spacing w:after="160" w:before="80" w:line="280"/>
         <w:ind w:left="120" w:right="120"/>
       </w:pPr>
@@ -147,7 +147,7 @@
           <w:sz w:val="21"/>
           <w:szCs w:val="21"/>
         </w:rPr>
-        <w:t xml:space="preserve">Release status, 23 September 2026.  </w:t>
+        <w:t xml:space="preserve">Release status, 24 September 2026.  </w:t>
       </w:r>
       <w:r>
         <w:rPr>
@@ -166,27 +166,7 @@
           <w:sz w:val="21"/>
           <w:szCs w:val="21"/>
         </w:rPr>
-        <w:t xml:space="preserve"> currently carries the contact list module and the campaign module (list, seven-step setup, campaign page, publish and send). It does </w:t>
-      </w:r>
-      <w:r>
-        <w:rPr>
-          <w:rFonts w:ascii="Calibri" w:cs="Calibri" w:eastAsia="Calibri" w:hAnsi="Calibri"/>
-          <w:b/>
-          <w:bCs/>
-          <w:color w:val="1F2937"/>
-          <w:sz w:val="21"/>
-          <w:szCs w:val="21"/>
-        </w:rPr>
-        <w:t xml:space="preserve">not yet</w:t>
-      </w:r>
-      <w:r>
-        <w:rPr>
-          <w:rFonts w:ascii="Calibri" w:cs="Calibri" w:eastAsia="Calibri" w:hAnsi="Calibri"/>
-          <w:color w:val="1F2937"/>
-          <w:sz w:val="21"/>
-          <w:szCs w:val="21"/>
-        </w:rPr>
-        <w:t xml:space="preserve"> include three finished pieces of work still on branch </w:t>
+        <w:t xml:space="preserve"> is the branch of record and carries everything: the contact list and campaign modules, the shared UI restyle, the campaign calendar view, the idle session timeout, the receipt layout editor's API, the dashboard totals and campaign-results performance work, and the public-address global parameter (patch 0018). The dev server 10.0.0.43 (</w:t>
       </w:r>
       <w:r>
         <w:rPr>
@@ -196,16 +176,16 @@
           <w:szCs w:val="19"/>
           <w:shd w:fill="EEF2F7" w:val="clear"/>
         </w:rPr>
-        <w:t xml:space="preserve">cep_dev_18_sep_26</w:t>
-      </w:r>
-      <w:r>
-        <w:rPr>
-          <w:rFonts w:ascii="Calibri" w:cs="Calibri" w:eastAsia="Calibri" w:hAnsi="Calibri"/>
-          <w:color w:val="1F2937"/>
-          <w:sz w:val="21"/>
-          <w:szCs w:val="21"/>
-        </w:rPr>
-        <w:t xml:space="preserve">, pending its pull request into </w:t>
+        <w:t xml:space="preserve">cepdev.aiintelekt.com</w:t>
+      </w:r>
+      <w:r>
+        <w:rPr>
+          <w:rFonts w:ascii="Calibri" w:cs="Calibri" w:eastAsia="Calibri" w:hAnsi="Calibri"/>
+          <w:color w:val="1F2937"/>
+          <w:sz w:val="21"/>
+          <w:szCs w:val="21"/>
+        </w:rPr>
+        <w:t xml:space="preserve">) deploys from </w:t>
       </w:r>
       <w:r>
         <w:rPr>
@@ -224,7 +204,7 @@
           <w:sz w:val="21"/>
           <w:szCs w:val="21"/>
         </w:rPr>
-        <w:t xml:space="preserve">: the shared UI restyle (the design tokens and component primitives this guide's screenshots do not reflect), the campaign calendar view, and the idle session timeout (section 3.1 and section 10 both note the two settings it adds). Confirm which commit is actually on </w:t>
+        <w:t xml:space="preserve">. Database patches 0001–0017 are applied to </w:t>
       </w:r>
       <w:r>
         <w:rPr>
@@ -234,16 +214,16 @@
           <w:szCs w:val="19"/>
           <w:shd w:fill="EEF2F7" w:val="clear"/>
         </w:rPr>
-        <w:t xml:space="preserve">main</w:t>
-      </w:r>
-      <w:r>
-        <w:rPr>
-          <w:rFonts w:ascii="Calibri" w:cs="Calibri" w:eastAsia="Calibri" w:hAnsi="Calibri"/>
-          <w:color w:val="1F2937"/>
-          <w:sz w:val="21"/>
-          <w:szCs w:val="21"/>
-        </w:rPr>
-        <w:t xml:space="preserve"> (</w:t>
+        <w:t xml:space="preserve">cep_db</w:t>
+      </w:r>
+      <w:r>
+        <w:rPr>
+          <w:rFonts w:ascii="Calibri" w:cs="Calibri" w:eastAsia="Calibri" w:hAnsi="Calibri"/>
+          <w:color w:val="1F2937"/>
+          <w:sz w:val="21"/>
+          <w:szCs w:val="21"/>
+        </w:rPr>
+        <w:t xml:space="preserve">; 0018 is the one this release adds (section 3.1). Confirm the commit on </w:t>
       </w:r>
       <w:r>
         <w:rPr>
@@ -253,16 +233,16 @@
           <w:szCs w:val="19"/>
           <w:shd w:fill="EEF2F7" w:val="clear"/>
         </w:rPr>
-        <w:t xml:space="preserve">git log -1</w:t>
-      </w:r>
-      <w:r>
-        <w:rPr>
-          <w:rFonts w:ascii="Calibri" w:cs="Calibri" w:eastAsia="Calibri" w:hAnsi="Calibri"/>
-          <w:color w:val="1F2937"/>
-          <w:sz w:val="21"/>
-          <w:szCs w:val="21"/>
-        </w:rPr>
-        <w:t xml:space="preserve">) before treating this guide as a description of what a fresh deployment will contain, and prefer deploying </w:t>
+        <w:t xml:space="preserve">main</w:t>
+      </w:r>
+      <w:r>
+        <w:rPr>
+          <w:rFonts w:ascii="Calibri" w:cs="Calibri" w:eastAsia="Calibri" w:hAnsi="Calibri"/>
+          <w:color w:val="1F2937"/>
+          <w:sz w:val="21"/>
+          <w:szCs w:val="21"/>
+        </w:rPr>
+        <w:t xml:space="preserve"> with </w:t>
       </w:r>
       <w:r>
         <w:rPr>
@@ -272,35 +252,16 @@
           <w:szCs w:val="19"/>
           <w:shd w:fill="EEF2F7" w:val="clear"/>
         </w:rPr>
-        <w:t xml:space="preserve">cep_dev_18_sep_26</w:t>
-      </w:r>
-      <w:r>
-        <w:rPr>
-          <w:rFonts w:ascii="Calibri" w:cs="Calibri" w:eastAsia="Calibri" w:hAnsi="Calibri"/>
-          <w:color w:val="1F2937"/>
-          <w:sz w:val="21"/>
-          <w:szCs w:val="21"/>
-        </w:rPr>
-        <w:t xml:space="preserve"> — or </w:t>
-      </w:r>
-      <w:r>
-        <w:rPr>
-          <w:rFonts w:ascii="Consolas" w:cs="Consolas" w:eastAsia="Consolas" w:hAnsi="Consolas"/>
-          <w:color w:val="0F172A"/>
-          <w:sz w:val="19"/>
-          <w:szCs w:val="19"/>
-          <w:shd w:fill="EEF2F7" w:val="clear"/>
-        </w:rPr>
-        <w:t xml:space="preserve">main</w:t>
-      </w:r>
-      <w:r>
-        <w:rPr>
-          <w:rFonts w:ascii="Calibri" w:cs="Calibri" w:eastAsia="Calibri" w:hAnsi="Calibri"/>
-          <w:color w:val="1F2937"/>
-          <w:sz w:val="21"/>
-          <w:szCs w:val="21"/>
-        </w:rPr>
-        <w:t xml:space="preserve"> once that branch is merged — over an older commit.</w:t>
+        <w:t xml:space="preserve">git log -1</w:t>
+      </w:r>
+      <w:r>
+        <w:rPr>
+          <w:rFonts w:ascii="Calibri" w:cs="Calibri" w:eastAsia="Calibri" w:hAnsi="Calibri"/>
+          <w:color w:val="1F2937"/>
+          <w:sz w:val="21"/>
+          <w:szCs w:val="21"/>
+        </w:rPr>
+        <w:t xml:space="preserve"> before deploying.</w:t>
       </w:r>
     </w:p>
     <w:p>
@@ -3407,7 +3368,7 @@
           <w:sz w:val="21"/>
           <w:szCs w:val="21"/>
         </w:rPr>
-        <w:t xml:space="preserve">The schema, all five DDL layers and patches 0001–0015 are already applied to </w:t>
+        <w:t xml:space="preserve">The schema, all five DDL layers and patches 0001–0017 are already applied to </w:t>
       </w:r>
       <w:r>
         <w:rPr>
@@ -3426,7 +3387,26 @@
           <w:sz w:val="21"/>
           <w:szCs w:val="21"/>
         </w:rPr>
-        <w:t xml:space="preserve">, and the three logins exist. Patch 0016 (the idle session timeout's two global parameters) is applied locally only as of this version of the guide; apply it as part of the release that brings the frontend change live (section 3.3). Nothing else has to be created. Two things to check from the new application server:</w:t>
+        <w:t xml:space="preserve">, and the three logins exist. Patch 0018 (the </w:t>
+      </w:r>
+      <w:r>
+        <w:rPr>
+          <w:rFonts w:ascii="Consolas" w:cs="Consolas" w:eastAsia="Consolas" w:hAnsi="Consolas"/>
+          <w:color w:val="0F172A"/>
+          <w:sz w:val="19"/>
+          <w:szCs w:val="19"/>
+          <w:shd w:fill="EEF2F7" w:val="clear"/>
+        </w:rPr>
+        <w:t xml:space="preserve">platform.api_public_url</w:t>
+      </w:r>
+      <w:r>
+        <w:rPr>
+          <w:rFonts w:ascii="Calibri" w:cs="Calibri" w:eastAsia="Calibri" w:hAnsi="Calibri"/>
+          <w:color w:val="1F2937"/>
+          <w:sz w:val="21"/>
+          <w:szCs w:val="21"/>
+        </w:rPr>
+        <w:t xml:space="preserve"> global parameter) ships with this release and is not yet applied as of this version of the guide: apply it with the release that brings the parameter live (section 3.3), then set the parameter (section 10). Nothing else has to be created. Two things to check from the new application server:</w:t>
       </w:r>
     </w:p>
     <w:p>

</xml_diff>

<commit_message>
Deployment guide v1.6: the template clone endpoint and the PR #15 release in the status note and the verification checks
Co-Authored-By: Claude Fable 5.1 <noreply@anthropic.com>
</commit_message>
<xml_diff>
--- a/docs/CEP_Deployment_Guide.docx
+++ b/docs/CEP_Deployment_Guide.docx
@@ -43,7 +43,7 @@
           <w:sz w:val="21"/>
           <w:szCs w:val="21"/>
         </w:rPr>
-        <w:t xml:space="preserve">Version 1.5  ·  24 September 2026  ·  Repository: github.com/Git-aiintelekt/CEP (branch main)</w:t>
+        <w:t xml:space="preserve">Version 1.6  ·  24 September 2026  ·  Repository: github.com/Git-aiintelekt/CEP (branch main)</w:t>
       </w:r>
     </w:p>
     <w:p>
@@ -166,7 +166,7 @@
           <w:sz w:val="21"/>
           <w:szCs w:val="21"/>
         </w:rPr>
-        <w:t xml:space="preserve"> is the branch of record and carries everything: the contact list and campaign modules, the shared UI restyle, the campaign calendar view, the idle session timeout, the receipt layout editor's API, the dashboard totals and campaign-results performance work, and the public-address global parameter (patch 0018). The dev server 10.0.0.43 (</w:t>
+        <w:t xml:space="preserve"> is the branch of record and carries everything: the contact list and campaign modules, the shared UI restyle, the campaign calendar view, the idle session timeout, the receipt layout editor's API, the dashboard totals and campaign-results performance work, the public-address global parameter (patch 0018), and the template designer release (PR #15, commit </w:t>
       </w:r>
       <w:r>
         <w:rPr>
@@ -176,16 +176,16 @@
           <w:szCs w:val="19"/>
           <w:shd w:fill="EEF2F7" w:val="clear"/>
         </w:rPr>
-        <w:t xml:space="preserve">cepdev.aiintelekt.com</w:t>
-      </w:r>
-      <w:r>
-        <w:rPr>
-          <w:rFonts w:ascii="Calibri" w:cs="Calibri" w:eastAsia="Calibri" w:hAnsi="Calibri"/>
-          <w:color w:val="1F2937"/>
-          <w:sz w:val="21"/>
-          <w:szCs w:val="21"/>
-        </w:rPr>
-        <w:t xml:space="preserve">) deploys from </w:t>
+        <w:t xml:space="preserve">78f7788</w:t>
+      </w:r>
+      <w:r>
+        <w:rPr>
+          <w:rFonts w:ascii="Calibri" w:cs="Calibri" w:eastAsia="Calibri" w:hAnsi="Calibri"/>
+          <w:color w:val="1F2937"/>
+          <w:sz w:val="21"/>
+          <w:szCs w:val="21"/>
+        </w:rPr>
+        <w:t xml:space="preserve">): a new endpoint </w:t>
       </w:r>
       <w:r>
         <w:rPr>
@@ -195,6 +195,63 @@
           <w:szCs w:val="19"/>
           <w:shd w:fill="EEF2F7" w:val="clear"/>
         </w:rPr>
+        <w:t xml:space="preserve">POST /api/v1/templates/{id}/clone/</w:t>
+      </w:r>
+      <w:r>
+        <w:rPr>
+          <w:rFonts w:ascii="Calibri" w:cs="Calibri" w:eastAsia="Calibri" w:hAnsi="Calibri"/>
+          <w:color w:val="1F2937"/>
+          <w:sz w:val="21"/>
+          <w:szCs w:val="21"/>
+        </w:rPr>
+        <w:t xml:space="preserve"> that makes a DRAFT copy of a template (its latest design or message becomes version 1 of the copy; the Templates page calls it from the row menu's Duplicate), a fix for the false "saved by someone else (now at version 0)" conflict on every second designer save, and designer autosave. That release changes Python and frontend code only — no schema patch — so deploying it is a pull and a restart of </w:t>
+      </w:r>
+      <w:r>
+        <w:rPr>
+          <w:rFonts w:ascii="Consolas" w:cs="Consolas" w:eastAsia="Consolas" w:hAnsi="Consolas"/>
+          <w:color w:val="0F172A"/>
+          <w:sz w:val="19"/>
+          <w:szCs w:val="19"/>
+          <w:shd w:fill="EEF2F7" w:val="clear"/>
+        </w:rPr>
+        <w:t xml:space="preserve">cep-api</w:t>
+      </w:r>
+      <w:r>
+        <w:rPr>
+          <w:rFonts w:ascii="Calibri" w:cs="Calibri" w:eastAsia="Calibri" w:hAnsi="Calibri"/>
+          <w:color w:val="1F2937"/>
+          <w:sz w:val="21"/>
+          <w:szCs w:val="21"/>
+        </w:rPr>
+        <w:t xml:space="preserve"> (section 3.3 for the general procedure). The dev server 10.0.0.43 (</w:t>
+      </w:r>
+      <w:r>
+        <w:rPr>
+          <w:rFonts w:ascii="Consolas" w:cs="Consolas" w:eastAsia="Consolas" w:hAnsi="Consolas"/>
+          <w:color w:val="0F172A"/>
+          <w:sz w:val="19"/>
+          <w:szCs w:val="19"/>
+          <w:shd w:fill="EEF2F7" w:val="clear"/>
+        </w:rPr>
+        <w:t xml:space="preserve">cepdev.aiintelekt.com</w:t>
+      </w:r>
+      <w:r>
+        <w:rPr>
+          <w:rFonts w:ascii="Calibri" w:cs="Calibri" w:eastAsia="Calibri" w:hAnsi="Calibri"/>
+          <w:color w:val="1F2937"/>
+          <w:sz w:val="21"/>
+          <w:szCs w:val="21"/>
+        </w:rPr>
+        <w:t xml:space="preserve">) deploys from </w:t>
+      </w:r>
+      <w:r>
+        <w:rPr>
+          <w:rFonts w:ascii="Consolas" w:cs="Consolas" w:eastAsia="Consolas" w:hAnsi="Consolas"/>
+          <w:color w:val="0F172A"/>
+          <w:sz w:val="19"/>
+          <w:szCs w:val="19"/>
+          <w:shd w:fill="EEF2F7" w:val="clear"/>
+        </w:rPr>
         <w:t xml:space="preserve">main</w:t>
       </w:r>
       <w:r>
@@ -204,7 +261,7 @@
           <w:sz w:val="21"/>
           <w:szCs w:val="21"/>
         </w:rPr>
-        <w:t xml:space="preserve">. Database patches 0001–0017 are applied to </w:t>
+        <w:t xml:space="preserve"> and runs it. Database patches 0001–0017 are applied to </w:t>
       </w:r>
       <w:r>
         <w:rPr>
@@ -10157,7 +10214,123 @@
                 <w:sz w:val="21"/>
                 <w:szCs w:val="21"/>
               </w:rPr>
-              <w:t xml:space="preserve">Swagger UI lists the API.</w:t>
+              <w:t xml:space="preserve">Swagger UI lists the API, including </w:t>
+            </w:r>
+            <w:r>
+              <w:rPr>
+                <w:rFonts w:ascii="Consolas" w:cs="Consolas" w:eastAsia="Consolas" w:hAnsi="Consolas"/>
+                <w:color w:val="0F172A"/>
+                <w:sz w:val="19"/>
+                <w:szCs w:val="19"/>
+                <w:shd w:fill="EEF2F7" w:val="clear"/>
+              </w:rPr>
+              <w:t xml:space="preserve">POST /api/v1/templates/{id}/clone/</w:t>
+            </w:r>
+            <w:r>
+              <w:rPr>
+                <w:rFonts w:ascii="Calibri" w:cs="Calibri" w:eastAsia="Calibri" w:hAnsi="Calibri"/>
+                <w:color w:val="1F2937"/>
+                <w:sz w:val="21"/>
+                <w:szCs w:val="21"/>
+              </w:rPr>
+              <w:t xml:space="preserve">.</w:t>
+            </w:r>
+          </w:p>
+        </w:tc>
+      </w:tr>
+      <w:tr>
+        <w:trPr>
+          <w:cantSplit/>
+        </w:trPr>
+        <w:tc>
+          <w:tcPr>
+            <w:tcW w:type="dxa" w:w="4200"/>
+            <w:tcBorders>
+              <w:top w:val="single" w:color="D1D5DB" w:sz="4"/>
+              <w:left w:val="single" w:color="D1D5DB" w:sz="4"/>
+              <w:bottom w:val="single" w:color="D1D5DB" w:sz="4"/>
+              <w:right w:val="single" w:color="D1D5DB" w:sz="4"/>
+            </w:tcBorders>
+            <w:tcMar>
+              <w:top w:type="dxa" w:w="70"/>
+              <w:left w:type="dxa" w:w="100"/>
+              <w:bottom w:type="dxa" w:w="70"/>
+              <w:right w:type="dxa" w:w="100"/>
+            </w:tcMar>
+          </w:tcPr>
+          <w:p>
+            <w:pPr>
+              <w:spacing w:after="30" w:line="260"/>
+            </w:pPr>
+            <w:r>
+              <w:rPr>
+                <w:rFonts w:ascii="Consolas" w:cs="Consolas" w:eastAsia="Consolas" w:hAnsi="Consolas"/>
+                <w:color w:val="0F172A"/>
+                <w:sz w:val="19"/>
+                <w:szCs w:val="19"/>
+                <w:shd w:fill="EEF2F7" w:val="clear"/>
+              </w:rPr>
+              <w:t xml:space="preserve">curl -s -o /dev/null -w "%{http_code}" -X POST -H "X-Tenant: &lt;workspace code&gt;" https://app.cep.example.com/api/v1/templates/00000000-0000-4000-8000-000000000000/clone/</w:t>
+            </w:r>
+          </w:p>
+        </w:tc>
+        <w:tc>
+          <w:tcPr>
+            <w:tcW w:type="dxa" w:w="4826"/>
+            <w:tcBorders>
+              <w:top w:val="single" w:color="D1D5DB" w:sz="4"/>
+              <w:left w:val="single" w:color="D1D5DB" w:sz="4"/>
+              <w:bottom w:val="single" w:color="D1D5DB" w:sz="4"/>
+              <w:right w:val="single" w:color="D1D5DB" w:sz="4"/>
+            </w:tcBorders>
+            <w:tcMar>
+              <w:top w:type="dxa" w:w="70"/>
+              <w:left w:type="dxa" w:w="100"/>
+              <w:bottom w:type="dxa" w:w="70"/>
+              <w:right w:type="dxa" w:w="100"/>
+            </w:tcMar>
+          </w:tcPr>
+          <w:p>
+            <w:pPr>
+              <w:spacing w:after="30" w:line="260"/>
+            </w:pPr>
+            <w:r>
+              <w:rPr>
+                <w:rFonts w:ascii="Consolas" w:cs="Consolas" w:eastAsia="Consolas" w:hAnsi="Consolas"/>
+                <w:color w:val="0F172A"/>
+                <w:sz w:val="19"/>
+                <w:szCs w:val="19"/>
+                <w:shd w:fill="EEF2F7" w:val="clear"/>
+              </w:rPr>
+              <w:t xml:space="preserve">401</w:t>
+            </w:r>
+            <w:r>
+              <w:rPr>
+                <w:rFonts w:ascii="Calibri" w:cs="Calibri" w:eastAsia="Calibri" w:hAnsi="Calibri"/>
+                <w:color w:val="1F2937"/>
+                <w:sz w:val="21"/>
+                <w:szCs w:val="21"/>
+              </w:rPr>
+              <w:t xml:space="preserve"> — the clone route is served and asks for a sign-in (a </w:t>
+            </w:r>
+            <w:r>
+              <w:rPr>
+                <w:rFonts w:ascii="Consolas" w:cs="Consolas" w:eastAsia="Consolas" w:hAnsi="Consolas"/>
+                <w:color w:val="0F172A"/>
+                <w:sz w:val="19"/>
+                <w:szCs w:val="19"/>
+                <w:shd w:fill="EEF2F7" w:val="clear"/>
+              </w:rPr>
+              <w:t xml:space="preserve">404</w:t>
+            </w:r>
+            <w:r>
+              <w:rPr>
+                <w:rFonts w:ascii="Calibri" w:cs="Calibri" w:eastAsia="Calibri" w:hAnsi="Calibri"/>
+                <w:color w:val="1F2937"/>
+                <w:sz w:val="21"/>
+                <w:szCs w:val="21"/>
+              </w:rPr>
+              <w:t xml:space="preserve"> means the API is still running code from before PR #15). Signed in, Templates → row menu → Duplicate creates "&lt;name&gt; (copy)" as a draft and opens it.</w:t>
             </w:r>
           </w:p>
         </w:tc>

</xml_diff>

<commit_message>
Deployment guide v1.7: the Templates landing page release, patch 0018 recorded as applied, and a verification check for the new page
Co-Authored-By: Claude Fable 5.1 <noreply@anthropic.com>
</commit_message>
<xml_diff>
--- a/docs/CEP_Deployment_Guide.docx
+++ b/docs/CEP_Deployment_Guide.docx
@@ -43,7 +43,7 @@
           <w:sz w:val="21"/>
           <w:szCs w:val="21"/>
         </w:rPr>
-        <w:t xml:space="preserve">Version 1.6  ·  24 September 2026  ·  Repository: github.com/Git-aiintelekt/CEP (branch main)</w:t>
+        <w:t xml:space="preserve">Version 1.7  ·  25 September 2026  ·  Repository: github.com/Git-aiintelekt/CEP (branch main)</w:t>
       </w:r>
     </w:p>
     <w:p>
@@ -147,7 +147,7 @@
           <w:sz w:val="21"/>
           <w:szCs w:val="21"/>
         </w:rPr>
-        <w:t xml:space="preserve">Release status, 24 September 2026.  </w:t>
+        <w:t xml:space="preserve">Release status, 25 September 2026.  </w:t>
       </w:r>
       <w:r>
         <w:rPr>
@@ -166,7 +166,7 @@
           <w:sz w:val="21"/>
           <w:szCs w:val="21"/>
         </w:rPr>
-        <w:t xml:space="preserve"> is the branch of record and carries everything: the contact list and campaign modules, the shared UI restyle, the campaign calendar view, the idle session timeout, the receipt layout editor's API, the dashboard totals and campaign-results performance work, the public-address global parameter (patch 0018), and the template designer release (PR #15, commit </w:t>
+        <w:t xml:space="preserve"> is the branch of record and carries everything: the contact list and campaign modules, the shared UI restyle, the campaign calendar view, the idle session timeout, the receipt layout editor's API, the dashboard totals and campaign-results performance work, the public-address global parameter (patch 0018), the Templates landing page (merge commit </w:t>
       </w:r>
       <w:r>
         <w:rPr>
@@ -176,16 +176,16 @@
           <w:szCs w:val="19"/>
           <w:shd w:fill="EEF2F7" w:val="clear"/>
         </w:rPr>
-        <w:t xml:space="preserve">78f7788</w:t>
-      </w:r>
-      <w:r>
-        <w:rPr>
-          <w:rFonts w:ascii="Calibri" w:cs="Calibri" w:eastAsia="Calibri" w:hAnsi="Calibri"/>
-          <w:color w:val="1F2937"/>
-          <w:sz w:val="21"/>
-          <w:szCs w:val="21"/>
-        </w:rPr>
-        <w:t xml:space="preserve">): a new endpoint </w:t>
+        <w:t xml:space="preserve">b2f959e</w:t>
+      </w:r>
+      <w:r>
+        <w:rPr>
+          <w:rFonts w:ascii="Calibri" w:cs="Calibri" w:eastAsia="Calibri" w:hAnsi="Calibri"/>
+          <w:color w:val="1F2937"/>
+          <w:sz w:val="21"/>
+          <w:szCs w:val="21"/>
+        </w:rPr>
+        <w:t xml:space="preserve">: </w:t>
       </w:r>
       <w:r>
         <w:rPr>
@@ -195,16 +195,16 @@
           <w:szCs w:val="19"/>
           <w:shd w:fill="EEF2F7" w:val="clear"/>
         </w:rPr>
-        <w:t xml:space="preserve">POST /api/v1/templates/{id}/clone/</w:t>
-      </w:r>
-      <w:r>
-        <w:rPr>
-          <w:rFonts w:ascii="Calibri" w:cs="Calibri" w:eastAsia="Calibri" w:hAnsi="Calibri"/>
-          <w:color w:val="1F2937"/>
-          <w:sz w:val="21"/>
-          <w:szCs w:val="21"/>
-        </w:rPr>
-        <w:t xml:space="preserve"> that makes a DRAFT copy of a template (its latest design or message becomes version 1 of the copy; the Templates page calls it from the row menu's Duplicate), a fix for the false "saved by someone else (now at version 0)" conflict on every second designer save, and designer autosave. That release changes Python and frontend code only — no schema patch — so deploying it is a pull and a restart of </w:t>
+        <w:t xml:space="preserve">/templates</w:t>
+      </w:r>
+      <w:r>
+        <w:rPr>
+          <w:rFonts w:ascii="Calibri" w:cs="Calibri" w:eastAsia="Calibri" w:hAnsi="Calibri"/>
+          <w:color w:val="1F2937"/>
+          <w:sz w:val="21"/>
+          <w:szCs w:val="21"/>
+        </w:rPr>
+        <w:t xml:space="preserve"> is now a landing page with quick-create cards per channel and a template library in grid or list view — channel tabs, status filter, search, a preview dialog, and the CEP presets listed after the workspace's own templates; a preset is copied into a new draft entirely on the client through the existing create, design, message and receipt endpoints, so it needs no server change), and the template designer release (PR #15, commit </w:t>
       </w:r>
       <w:r>
         <w:rPr>
@@ -214,16 +214,16 @@
           <w:szCs w:val="19"/>
           <w:shd w:fill="EEF2F7" w:val="clear"/>
         </w:rPr>
-        <w:t xml:space="preserve">cep-api</w:t>
-      </w:r>
-      <w:r>
-        <w:rPr>
-          <w:rFonts w:ascii="Calibri" w:cs="Calibri" w:eastAsia="Calibri" w:hAnsi="Calibri"/>
-          <w:color w:val="1F2937"/>
-          <w:sz w:val="21"/>
-          <w:szCs w:val="21"/>
-        </w:rPr>
-        <w:t xml:space="preserve"> (section 3.3 for the general procedure). The dev server 10.0.0.43 (</w:t>
+        <w:t xml:space="preserve">78f7788</w:t>
+      </w:r>
+      <w:r>
+        <w:rPr>
+          <w:rFonts w:ascii="Calibri" w:cs="Calibri" w:eastAsia="Calibri" w:hAnsi="Calibri"/>
+          <w:color w:val="1F2937"/>
+          <w:sz w:val="21"/>
+          <w:szCs w:val="21"/>
+        </w:rPr>
+        <w:t xml:space="preserve">): a new endpoint </w:t>
       </w:r>
       <w:r>
         <w:rPr>
@@ -233,16 +233,16 @@
           <w:szCs w:val="19"/>
           <w:shd w:fill="EEF2F7" w:val="clear"/>
         </w:rPr>
-        <w:t xml:space="preserve">cepdev.aiintelekt.com</w:t>
-      </w:r>
-      <w:r>
-        <w:rPr>
-          <w:rFonts w:ascii="Calibri" w:cs="Calibri" w:eastAsia="Calibri" w:hAnsi="Calibri"/>
-          <w:color w:val="1F2937"/>
-          <w:sz w:val="21"/>
-          <w:szCs w:val="21"/>
-        </w:rPr>
-        <w:t xml:space="preserve">) deploys from </w:t>
+        <w:t xml:space="preserve">POST /api/v1/templates/{id}/clone/</w:t>
+      </w:r>
+      <w:r>
+        <w:rPr>
+          <w:rFonts w:ascii="Calibri" w:cs="Calibri" w:eastAsia="Calibri" w:hAnsi="Calibri"/>
+          <w:color w:val="1F2937"/>
+          <w:sz w:val="21"/>
+          <w:szCs w:val="21"/>
+        </w:rPr>
+        <w:t xml:space="preserve"> that makes a DRAFT copy of a template (its latest design or message becomes version 1 of the copy; the Templates page calls it from the row menu's Duplicate), a fix for the false "saved by someone else (now at version 0)" conflict on every second designer save, and designer autosave. Those two releases change Python and frontend code only — no schema patch — so deploying them is a pull, a frontend build and a restart of </w:t>
       </w:r>
       <w:r>
         <w:rPr>
@@ -252,16 +252,16 @@
           <w:szCs w:val="19"/>
           <w:shd w:fill="EEF2F7" w:val="clear"/>
         </w:rPr>
-        <w:t xml:space="preserve">main</w:t>
-      </w:r>
-      <w:r>
-        <w:rPr>
-          <w:rFonts w:ascii="Calibri" w:cs="Calibri" w:eastAsia="Calibri" w:hAnsi="Calibri"/>
-          <w:color w:val="1F2937"/>
-          <w:sz w:val="21"/>
-          <w:szCs w:val="21"/>
-        </w:rPr>
-        <w:t xml:space="preserve"> and runs it. Database patches 0001–0017 are applied to </w:t>
+        <w:t xml:space="preserve">cep-api</w:t>
+      </w:r>
+      <w:r>
+        <w:rPr>
+          <w:rFonts w:ascii="Calibri" w:cs="Calibri" w:eastAsia="Calibri" w:hAnsi="Calibri"/>
+          <w:color w:val="1F2937"/>
+          <w:sz w:val="21"/>
+          <w:szCs w:val="21"/>
+        </w:rPr>
+        <w:t xml:space="preserve"> (section 3.3 for the general procedure). The dev server 10.0.0.43 (</w:t>
       </w:r>
       <w:r>
         <w:rPr>
@@ -271,6 +271,44 @@
           <w:szCs w:val="19"/>
           <w:shd w:fill="EEF2F7" w:val="clear"/>
         </w:rPr>
+        <w:t xml:space="preserve">cepdev.aiintelekt.com</w:t>
+      </w:r>
+      <w:r>
+        <w:rPr>
+          <w:rFonts w:ascii="Calibri" w:cs="Calibri" w:eastAsia="Calibri" w:hAnsi="Calibri"/>
+          <w:color w:val="1F2937"/>
+          <w:sz w:val="21"/>
+          <w:szCs w:val="21"/>
+        </w:rPr>
+        <w:t xml:space="preserve">) deploys from </w:t>
+      </w:r>
+      <w:r>
+        <w:rPr>
+          <w:rFonts w:ascii="Consolas" w:cs="Consolas" w:eastAsia="Consolas" w:hAnsi="Consolas"/>
+          <w:color w:val="0F172A"/>
+          <w:sz w:val="19"/>
+          <w:szCs w:val="19"/>
+          <w:shd w:fill="EEF2F7" w:val="clear"/>
+        </w:rPr>
+        <w:t xml:space="preserve">main</w:t>
+      </w:r>
+      <w:r>
+        <w:rPr>
+          <w:rFonts w:ascii="Calibri" w:cs="Calibri" w:eastAsia="Calibri" w:hAnsi="Calibri"/>
+          <w:color w:val="1F2937"/>
+          <w:sz w:val="21"/>
+          <w:szCs w:val="21"/>
+        </w:rPr>
+        <w:t xml:space="preserve"> and runs all of it. Database patches 0001–0018 are applied to </w:t>
+      </w:r>
+      <w:r>
+        <w:rPr>
+          <w:rFonts w:ascii="Consolas" w:cs="Consolas" w:eastAsia="Consolas" w:hAnsi="Consolas"/>
+          <w:color w:val="0F172A"/>
+          <w:sz w:val="19"/>
+          <w:szCs w:val="19"/>
+          <w:shd w:fill="EEF2F7" w:val="clear"/>
+        </w:rPr>
         <w:t xml:space="preserve">cep_db</w:t>
       </w:r>
       <w:r>
@@ -280,7 +318,7 @@
           <w:sz w:val="21"/>
           <w:szCs w:val="21"/>
         </w:rPr>
-        <w:t xml:space="preserve">; 0018 is the one this release adds (section 3.1). Confirm the commit on </w:t>
+        <w:t xml:space="preserve"> (0018 on 25 September 2026); section 3.1 describes the same check for any other environment. Confirm the commit on </w:t>
       </w:r>
       <w:r>
         <w:rPr>
@@ -3425,7 +3463,7 @@
           <w:sz w:val="21"/>
           <w:szCs w:val="21"/>
         </w:rPr>
-        <w:t xml:space="preserve">The schema, all five DDL layers and patches 0001–0017 are already applied to </w:t>
+        <w:t xml:space="preserve">The schema, all five DDL layers and patches 0001–0018 are already applied to </w:t>
       </w:r>
       <w:r>
         <w:rPr>
@@ -3444,7 +3482,7 @@
           <w:sz w:val="21"/>
           <w:szCs w:val="21"/>
         </w:rPr>
-        <w:t xml:space="preserve">, and the three logins exist. Patch 0018 (the </w:t>
+        <w:t xml:space="preserve"> (0018, the </w:t>
       </w:r>
       <w:r>
         <w:rPr>
@@ -3463,7 +3501,7 @@
           <w:sz w:val="21"/>
           <w:szCs w:val="21"/>
         </w:rPr>
-        <w:t xml:space="preserve"> global parameter) ships with this release and is not yet applied as of this version of the guide: apply it with the release that brings the parameter live (section 3.3), then set the parameter (section 10). Nothing else has to be created. Two things to check from the new application server:</w:t>
+        <w:t xml:space="preserve"> global parameter, on 25 September 2026), and the three logins exist. Set the parameter itself in the back-office (section 10). Nothing else has to be created. Two things to check from the new application server:</w:t>
       </w:r>
     </w:p>
     <w:p>
@@ -10571,6 +10609,92 @@
                 <w:szCs w:val="21"/>
               </w:rPr>
               <w:t xml:space="preserve">Data of that tenant only.</w:t>
+            </w:r>
+          </w:p>
+        </w:tc>
+      </w:tr>
+      <w:tr>
+        <w:trPr>
+          <w:cantSplit/>
+        </w:trPr>
+        <w:tc>
+          <w:tcPr>
+            <w:tcW w:type="dxa" w:w="4200"/>
+            <w:tcBorders>
+              <w:top w:val="single" w:color="D1D5DB" w:sz="4"/>
+              <w:left w:val="single" w:color="D1D5DB" w:sz="4"/>
+              <w:bottom w:val="single" w:color="D1D5DB" w:sz="4"/>
+              <w:right w:val="single" w:color="D1D5DB" w:sz="4"/>
+            </w:tcBorders>
+            <w:tcMar>
+              <w:top w:type="dxa" w:w="70"/>
+              <w:left w:type="dxa" w:w="100"/>
+              <w:bottom w:type="dxa" w:w="70"/>
+              <w:right w:type="dxa" w:w="100"/>
+            </w:tcMar>
+          </w:tcPr>
+          <w:p>
+            <w:pPr>
+              <w:spacing w:after="30" w:line="260"/>
+            </w:pPr>
+            <w:r>
+              <w:rPr>
+                <w:rFonts w:ascii="Calibri" w:cs="Calibri" w:eastAsia="Calibri" w:hAnsi="Calibri"/>
+                <w:color w:val="1F2937"/>
+                <w:sz w:val="21"/>
+                <w:szCs w:val="21"/>
+              </w:rPr>
+              <w:t xml:space="preserve">Sign in as a tenant user with </w:t>
+            </w:r>
+            <w:r>
+              <w:rPr>
+                <w:rFonts w:ascii="Consolas" w:cs="Consolas" w:eastAsia="Consolas" w:hAnsi="Consolas"/>
+                <w:color w:val="0F172A"/>
+                <w:sz w:val="19"/>
+                <w:szCs w:val="19"/>
+                <w:shd w:fill="EEF2F7" w:val="clear"/>
+              </w:rPr>
+              <w:t xml:space="preserve">template.edit</w:t>
+            </w:r>
+            <w:r>
+              <w:rPr>
+                <w:rFonts w:ascii="Calibri" w:cs="Calibri" w:eastAsia="Calibri" w:hAnsi="Calibri"/>
+                <w:color w:val="1F2937"/>
+                <w:sz w:val="21"/>
+                <w:szCs w:val="21"/>
+              </w:rPr>
+              <w:t xml:space="preserve">, open Templates</w:t>
+            </w:r>
+          </w:p>
+        </w:tc>
+        <w:tc>
+          <w:tcPr>
+            <w:tcW w:type="dxa" w:w="4826"/>
+            <w:tcBorders>
+              <w:top w:val="single" w:color="D1D5DB" w:sz="4"/>
+              <w:left w:val="single" w:color="D1D5DB" w:sz="4"/>
+              <w:bottom w:val="single" w:color="D1D5DB" w:sz="4"/>
+              <w:right w:val="single" w:color="D1D5DB" w:sz="4"/>
+            </w:tcBorders>
+            <w:tcMar>
+              <w:top w:type="dxa" w:w="70"/>
+              <w:left w:type="dxa" w:w="100"/>
+              <w:bottom w:type="dxa" w:w="70"/>
+              <w:right w:type="dxa" w:w="100"/>
+            </w:tcMar>
+          </w:tcPr>
+          <w:p>
+            <w:pPr>
+              <w:spacing w:after="30" w:line="260"/>
+            </w:pPr>
+            <w:r>
+              <w:rPr>
+                <w:rFonts w:ascii="Calibri" w:cs="Calibri" w:eastAsia="Calibri" w:hAnsi="Calibri"/>
+                <w:color w:val="1F2937"/>
+                <w:sz w:val="21"/>
+                <w:szCs w:val="21"/>
+              </w:rPr>
+              <w:t xml:space="preserve">The landing page: quick-create cards for the channels the workspace can use, then "Your Templates" with the workspace's templates followed by the CEP presets (a preset opens a preview whose footer copies it into a draft). Each template's ⋮ menu offers Preview, Open, Duplicate and Delete.</w:t>
             </w:r>
           </w:p>
         </w:tc>

</xml_diff>

<commit_message>
Settings -> Integrations: a 24-hour chart on every card
Calls per 15 minutes over the last day from GET /integrations/{id}/metrics/, bars to one scale with the failed and
throttled share on top in their own colours, the busiest quarter hour and its p95 in the caption, a plain note when
there were no calls. The deployment guide goes to v1.9 (Digivize, the charts); INTEGRATIONS.md drops both from its
open items.

Co-Authored-By: Claude Fable 5.1 <noreply@anthropic.com>
</commit_message>
<xml_diff>
--- a/docs/CEP_Deployment_Guide.docx
+++ b/docs/CEP_Deployment_Guide.docx
@@ -43,7 +43,7 @@
           <w:sz w:val="21"/>
           <w:szCs w:val="21"/>
         </w:rPr>
-        <w:t xml:space="preserve">Version 1.8  ·  26 September 2026  ·  Repository: github.com/Git-aiintelekt/CEP (branch main)</w:t>
+        <w:t xml:space="preserve">Version 1.9  ·  26 September 2026  ·  Repository: github.com/Git-aiintelekt/CEP (branch main)</w:t>
       </w:r>
     </w:p>
     <w:p>
@@ -156,7 +156,27 @@
           <w:sz w:val="21"/>
           <w:szCs w:val="21"/>
         </w:rPr>
-        <w:t xml:space="preserve">The integration bridge (branch </w:t>
+        <w:t xml:space="preserve">Since v1.8 the bridge gained the Digivize text engine (Settings → Sending engines → Add Engine → Digivize: API key, secret key, store number; </w:t>
+      </w:r>
+      <w:r>
+        <w:rPr>
+          <w:rFonts w:ascii="Calibri" w:cs="Calibri" w:eastAsia="Calibri" w:hAnsi="Calibri"/>
+          <w:b/>
+          <w:bCs/>
+          <w:color w:val="1F2937"/>
+          <w:sz w:val="21"/>
+          <w:szCs w:val="21"/>
+        </w:rPr>
+        <w:t xml:space="preserve">Check</w:t>
+      </w:r>
+      <w:r>
+        <w:rPr>
+          <w:rFonts w:ascii="Calibri" w:cs="Calibri" w:eastAsia="Calibri" w:hAnsi="Calibri"/>
+          <w:color w:val="1F2937"/>
+          <w:sz w:val="21"/>
+          <w:szCs w:val="21"/>
+        </w:rPr>
+        <w:t xml:space="preserve"> finds the signature form Digivize accepts and stores it on the engine, so run Check before the first send; register the engine's callback address with Digivize or paste it into the engine's settings for per-message receipts) and a 24-hour chart on every Settings → Integrations card. Both are code only: pull, build, restart. The integration bridge (branch </w:t>
       </w:r>
       <w:r>
         <w:rPr>
@@ -175,7 +195,7 @@
           <w:sz w:val="21"/>
           <w:szCs w:val="21"/>
         </w:rPr>
-        <w:t xml:space="preserve">, patches 0019 and 0020) is the release this version documents: every call to or from an outside system — the point of sale sending receipts in, Postal / SendGrid / the text engine carrying messages out, and the providers' callbacks — is throttled, protected by a circuit breaker and written to a per-tenant integration log with the request and the answer (credentials and card numbers masked). It adds three tables, four global parameters, a scheduled job (</w:t>
+        <w:t xml:space="preserve">, patches 0019 and 0020) is the release v1.8 documented: every call to or from an outside system — the point of sale sending receipts in, Postal / SendGrid / the text engine carrying messages out, and the providers' callbacks — is throttled, protected by a circuit breaker and written to a per-tenant integration log with the request and the answer (credentials and card numbers masked). It adds three tables, four global parameters, a scheduled job (</w:t>
       </w:r>
       <w:r>
         <w:rPr>
@@ -11054,6 +11074,92 @@
                 <w:szCs w:val="21"/>
               </w:rPr>
               <w:t xml:space="preserve">, Settings → Integrations shows a card per integration (POS receipts, each sending engine) with the last day's calls, failure rate, p95 and throttled count, and the call log below it; opening a call shows the request and the answer with credentials and card numbers masked.</w:t>
+            </w:r>
+          </w:p>
+        </w:tc>
+      </w:tr>
+      <w:tr>
+        <w:trPr>
+          <w:cantSplit/>
+        </w:trPr>
+        <w:tc>
+          <w:tcPr>
+            <w:tcW w:type="dxa" w:w="4200"/>
+            <w:tcBorders>
+              <w:top w:val="single" w:color="D1D5DB" w:sz="4"/>
+              <w:left w:val="single" w:color="D1D5DB" w:sz="4"/>
+              <w:bottom w:val="single" w:color="D1D5DB" w:sz="4"/>
+              <w:right w:val="single" w:color="D1D5DB" w:sz="4"/>
+            </w:tcBorders>
+            <w:tcMar>
+              <w:top w:type="dxa" w:w="70"/>
+              <w:left w:type="dxa" w:w="100"/>
+              <w:bottom w:type="dxa" w:w="70"/>
+              <w:right w:type="dxa" w:w="100"/>
+            </w:tcMar>
+          </w:tcPr>
+          <w:p>
+            <w:pPr>
+              <w:spacing w:after="30" w:line="260"/>
+            </w:pPr>
+            <w:r>
+              <w:rPr>
+                <w:rFonts w:ascii="Calibri" w:cs="Calibri" w:eastAsia="Calibri" w:hAnsi="Calibri"/>
+                <w:color w:val="1F2937"/>
+                <w:sz w:val="21"/>
+                <w:szCs w:val="21"/>
+              </w:rPr>
+              <w:t xml:space="preserve">Settings → Sending engines → Add Engine → Digivize, then Check</w:t>
+            </w:r>
+          </w:p>
+        </w:tc>
+        <w:tc>
+          <w:tcPr>
+            <w:tcW w:type="dxa" w:w="4826"/>
+            <w:tcBorders>
+              <w:top w:val="single" w:color="D1D5DB" w:sz="4"/>
+              <w:left w:val="single" w:color="D1D5DB" w:sz="4"/>
+              <w:bottom w:val="single" w:color="D1D5DB" w:sz="4"/>
+              <w:right w:val="single" w:color="D1D5DB" w:sz="4"/>
+            </w:tcBorders>
+            <w:tcMar>
+              <w:top w:type="dxa" w:w="70"/>
+              <w:left w:type="dxa" w:w="100"/>
+              <w:bottom w:type="dxa" w:w="70"/>
+              <w:right w:type="dxa" w:w="100"/>
+            </w:tcMar>
+          </w:tcPr>
+          <w:p>
+            <w:pPr>
+              <w:spacing w:after="30" w:line="260"/>
+            </w:pPr>
+            <w:r>
+              <w:rPr>
+                <w:rFonts w:ascii="Calibri" w:cs="Calibri" w:eastAsia="Calibri" w:hAnsi="Calibri"/>
+                <w:color w:val="1F2937"/>
+                <w:sz w:val="21"/>
+                <w:szCs w:val="21"/>
+              </w:rPr>
+              <w:t xml:space="preserve">"Signature form: &lt;name&gt;." and a green check on the row; "refused every known signature form" means the API key or the secret key is wrong. A text campaign sent through it shows </w:t>
+            </w:r>
+            <w:r>
+              <w:rPr>
+                <w:rFonts w:ascii="Consolas" w:cs="Consolas" w:eastAsia="Consolas" w:hAnsi="Consolas"/>
+                <w:color w:val="0F172A"/>
+                <w:sz w:val="19"/>
+                <w:szCs w:val="19"/>
+                <w:shd w:fill="EEF2F7" w:val="clear"/>
+              </w:rPr>
+              <w:t xml:space="preserve">POST .../sms/send</w:t>
+            </w:r>
+            <w:r>
+              <w:rPr>
+                <w:rFonts w:ascii="Calibri" w:cs="Calibri" w:eastAsia="Calibri" w:hAnsi="Calibri"/>
+                <w:color w:val="1F2937"/>
+                <w:sz w:val="21"/>
+                <w:szCs w:val="21"/>
+              </w:rPr>
+              <w:t xml:space="preserve"> rows in the call log with the key and signature masked.</w:t>
             </w:r>
           </w:p>
         </w:tc>

</xml_diff>

<commit_message>
Postal callbacks delivered twice are kept as DUPLICATE and applied once (patch 0021)
Postal retries a callback on anything but a 2xx, so the same event can arrive twice; a retried open or click used to
insert a second tracking row and count twice. The adapter now reads the callback's own uuid into the delivery event;
the endpoint stores it on the raw event row (new column provider_event_id) and, under an advisory lock, keeps a second
arrival as a DUPLICATE row with a processed time, never applies it, and reports it in the answer's duplicate count and
in the integration log. A callback without an id keeps the old behaviour. No unique index: the table is partitioned by
tenant and month, so the lock does the job. Guide v1.11.

Co-Authored-By: Claude Fable 5.1 <noreply@anthropic.com>
</commit_message>
<xml_diff>
--- a/docs/CEP_Deployment_Guide.docx
+++ b/docs/CEP_Deployment_Guide.docx
@@ -43,7 +43,7 @@
           <w:sz w:val="21"/>
           <w:szCs w:val="21"/>
         </w:rPr>
-        <w:t xml:space="preserve">Version 1.10  ·  26 September 2026  ·  Repository: github.com/Git-aiintelekt/CEP (branch main)</w:t>
+        <w:t xml:space="preserve">Version 1.11  ·  26 September 2026  ·  Repository: github.com/Git-aiintelekt/CEP (branch main)</w:t>
       </w:r>
     </w:p>
     <w:p>
@@ -156,7 +156,46 @@
           <w:sz w:val="21"/>
           <w:szCs w:val="21"/>
         </w:rPr>
-        <w:t xml:space="preserve">v1.10: the receipt layout is now rendered at send time into the outer design's slot (the sent e-receipt is what Preview &amp; Test shows), with a Code 128 return barcode served at </w:t>
+        <w:t xml:space="preserve">v1.11 adds </w:t>
+      </w:r>
+      <w:r>
+        <w:rPr>
+          <w:rFonts w:ascii="Calibri" w:cs="Calibri" w:eastAsia="Calibri" w:hAnsi="Calibri"/>
+          <w:b/>
+          <w:bCs/>
+          <w:color w:val="1F2937"/>
+          <w:sz w:val="21"/>
+          <w:szCs w:val="21"/>
+        </w:rPr>
+        <w:t xml:space="preserve">patch 0021</w:t>
+      </w:r>
+      <w:r>
+        <w:rPr>
+          <w:rFonts w:ascii="Calibri" w:cs="Calibri" w:eastAsia="Calibri" w:hAnsi="Calibri"/>
+          <w:color w:val="1F2937"/>
+          <w:sz w:val="21"/>
+          <w:szCs w:val="21"/>
+        </w:rPr>
+        <w:t xml:space="preserve"> (</w:t>
+      </w:r>
+      <w:r>
+        <w:rPr>
+          <w:rFonts w:ascii="Consolas" w:cs="Consolas" w:eastAsia="Consolas" w:hAnsi="Consolas"/>
+          <w:color w:val="0F172A"/>
+          <w:sz w:val="19"/>
+          <w:szCs w:val="19"/>
+          <w:shd w:fill="EEF2F7" w:val="clear"/>
+        </w:rPr>
+        <w:t xml:space="preserve">delivery_webhook_event.provider_event_id</w:t>
+      </w:r>
+      <w:r>
+        <w:rPr>
+          <w:rFonts w:ascii="Calibri" w:cs="Calibri" w:eastAsia="Calibri" w:hAnsi="Calibri"/>
+          <w:color w:val="1F2937"/>
+          <w:sz w:val="21"/>
+          <w:szCs w:val="21"/>
+        </w:rPr>
+        <w:t xml:space="preserve">, the DUPLICATE processing status): a Postal callback delivered twice is kept as a DUPLICATE row and never applied twice, so opens and clicks are counted once. Apply 0021 before restarting the API (section 3.3). v1.10: the receipt layout is now rendered at send time into the outer design's slot (the sent e-receipt is what Preview &amp; Test shows), with a Code 128 return barcode served at </w:t>
       </w:r>
       <w:r>
         <w:rPr>
@@ -3644,7 +3683,7 @@
           <w:sz w:val="21"/>
           <w:szCs w:val="21"/>
         </w:rPr>
-        <w:t xml:space="preserve"> global parameter, on 25 September 2026), and the three logins exist. Patches 0019 (the integration bridge: </w:t>
+        <w:t xml:space="preserve"> global parameter, on 25 September 2026), and the three logins exist. Patches 0019 (the integration bridge) and 0020 (</w:t>
       </w:r>
       <w:r>
         <w:rPr>
@@ -3654,16 +3693,16 @@
           <w:szCs w:val="19"/>
           <w:shd w:fill="EEF2F7" w:val="clear"/>
         </w:rPr>
-        <w:t xml:space="preserve">integration</w:t>
-      </w:r>
-      <w:r>
-        <w:rPr>
-          <w:rFonts w:ascii="Calibri" w:cs="Calibri" w:eastAsia="Calibri" w:hAnsi="Calibri"/>
-          <w:color w:val="1F2937"/>
-          <w:sz w:val="21"/>
-          <w:szCs w:val="21"/>
-        </w:rPr>
-        <w:t xml:space="preserve">, </w:t>
+        <w:t xml:space="preserve">delivery_provider.transactional_secret_enc</w:t>
+      </w:r>
+      <w:r>
+        <w:rPr>
+          <w:rFonts w:ascii="Calibri" w:cs="Calibri" w:eastAsia="Calibri" w:hAnsi="Calibri"/>
+          <w:color w:val="1F2937"/>
+          <w:sz w:val="21"/>
+          <w:szCs w:val="21"/>
+        </w:rPr>
+        <w:t xml:space="preserve">) were applied to </w:t>
       </w:r>
       <w:r>
         <w:rPr>
@@ -3673,16 +3712,16 @@
           <w:szCs w:val="19"/>
           <w:shd w:fill="EEF2F7" w:val="clear"/>
         </w:rPr>
-        <w:t xml:space="preserve">integration_log</w:t>
-      </w:r>
-      <w:r>
-        <w:rPr>
-          <w:rFonts w:ascii="Calibri" w:cs="Calibri" w:eastAsia="Calibri" w:hAnsi="Calibri"/>
-          <w:color w:val="1F2937"/>
-          <w:sz w:val="21"/>
-          <w:szCs w:val="21"/>
-        </w:rPr>
-        <w:t xml:space="preserve">, </w:t>
+        <w:t xml:space="preserve">cep_db</w:t>
+      </w:r>
+      <w:r>
+        <w:rPr>
+          <w:rFonts w:ascii="Calibri" w:cs="Calibri" w:eastAsia="Calibri" w:hAnsi="Calibri"/>
+          <w:color w:val="1F2937"/>
+          <w:sz w:val="21"/>
+          <w:szCs w:val="21"/>
+        </w:rPr>
+        <w:t xml:space="preserve"> on 25 September 2026. Patch 0021 (</w:t>
       </w:r>
       <w:r>
         <w:rPr>
@@ -3692,54 +3731,16 @@
           <w:szCs w:val="19"/>
           <w:shd w:fill="EEF2F7" w:val="clear"/>
         </w:rPr>
-        <w:t xml:space="preserve">integration_metric</w:t>
-      </w:r>
-      <w:r>
-        <w:rPr>
-          <w:rFonts w:ascii="Calibri" w:cs="Calibri" w:eastAsia="Calibri" w:hAnsi="Calibri"/>
-          <w:color w:val="1F2937"/>
-          <w:sz w:val="21"/>
-          <w:szCs w:val="21"/>
-        </w:rPr>
-        <w:t xml:space="preserve">, the log's monthly partitions per tenant and four </w:t>
-      </w:r>
-      <w:r>
-        <w:rPr>
-          <w:rFonts w:ascii="Consolas" w:cs="Consolas" w:eastAsia="Consolas" w:hAnsi="Consolas"/>
-          <w:color w:val="0F172A"/>
-          <w:sz w:val="19"/>
-          <w:szCs w:val="19"/>
-          <w:shd w:fill="EEF2F7" w:val="clear"/>
-        </w:rPr>
-        <w:t xml:space="preserve">integrations.*</w:t>
-      </w:r>
-      <w:r>
-        <w:rPr>
-          <w:rFonts w:ascii="Calibri" w:cs="Calibri" w:eastAsia="Calibri" w:hAnsi="Calibri"/>
-          <w:color w:val="1F2937"/>
-          <w:sz w:val="21"/>
-          <w:szCs w:val="21"/>
-        </w:rPr>
-        <w:t xml:space="preserve"> parameters) and 0020 (</w:t>
-      </w:r>
-      <w:r>
-        <w:rPr>
-          <w:rFonts w:ascii="Consolas" w:cs="Consolas" w:eastAsia="Consolas" w:hAnsi="Consolas"/>
-          <w:color w:val="0F172A"/>
-          <w:sz w:val="19"/>
-          <w:szCs w:val="19"/>
-          <w:shd w:fill="EEF2F7" w:val="clear"/>
-        </w:rPr>
-        <w:t xml:space="preserve">delivery_provider.transactional_secret_enc</w:t>
-      </w:r>
-      <w:r>
-        <w:rPr>
-          <w:rFonts w:ascii="Calibri" w:cs="Calibri" w:eastAsia="Calibri" w:hAnsi="Calibri"/>
-          <w:color w:val="1F2937"/>
-          <w:sz w:val="21"/>
-          <w:szCs w:val="21"/>
-        </w:rPr>
-        <w:t xml:space="preserve">) are </w:t>
+        <w:t xml:space="preserve">delivery_webhook_event.provider_event_id</w:t>
+      </w:r>
+      <w:r>
+        <w:rPr>
+          <w:rFonts w:ascii="Calibri" w:cs="Calibri" w:eastAsia="Calibri" w:hAnsi="Calibri"/>
+          <w:color w:val="1F2937"/>
+          <w:sz w:val="21"/>
+          <w:szCs w:val="21"/>
+        </w:rPr>
+        <w:t xml:space="preserve"> and the DUPLICATE status) is </w:t>
       </w:r>
       <w:r>
         <w:rPr>
@@ -3759,26 +3760,7 @@
           <w:sz w:val="21"/>
           <w:szCs w:val="21"/>
         </w:rPr>
-        <w:t xml:space="preserve"> to </w:t>
-      </w:r>
-      <w:r>
-        <w:rPr>
-          <w:rFonts w:ascii="Consolas" w:cs="Consolas" w:eastAsia="Consolas" w:hAnsi="Consolas"/>
-          <w:color w:val="0F172A"/>
-          <w:sz w:val="19"/>
-          <w:szCs w:val="19"/>
-          <w:shd w:fill="EEF2F7" w:val="clear"/>
-        </w:rPr>
-        <w:t xml:space="preserve">cep_db</w:t>
-      </w:r>
-      <w:r>
-        <w:rPr>
-          <w:rFonts w:ascii="Calibri" w:cs="Calibri" w:eastAsia="Calibri" w:hAnsi="Calibri"/>
-          <w:color w:val="1F2937"/>
-          <w:sz w:val="21"/>
-          <w:szCs w:val="21"/>
-        </w:rPr>
-        <w:t xml:space="preserve">: apply them, in order, with the release that carries them (section 3.3), before restarting the API — the new code reads those tables on every receipt call and every send. Set the parameter itself in the back-office (section 10). Nothing else has to be created. Two things to check from the new application server:</w:t>
+        <w:t xml:space="preserve">: apply it with the release that carries it (section 3.3), before restarting the API — the new code reads those tables on every receipt call and every send. Set the parameter itself in the back-office (section 10). Nothing else has to be created. Two things to check from the new application server:</w:t>
       </w:r>
     </w:p>
     <w:p>
@@ -4433,6 +4415,26 @@
           <w:left w:val="single" w:color="2753E4" w:sz="12" w:space="6"/>
         </w:pBdr>
         <w:shd w:fill="F3F4F6" w:val="clear"/>
+        <w:spacing w:after="0" w:before="0" w:line="250"/>
+        <w:ind w:left="120" w:right="120"/>
+      </w:pPr>
+      <w:r>
+        <w:rPr>
+          <w:rFonts w:ascii="Consolas" w:cs="Consolas" w:eastAsia="Consolas" w:hAnsi="Consolas"/>
+          <w:color w:val="0F172A"/>
+          <w:sz w:val="17"/>
+          <w:szCs w:val="17"/>
+        </w:rPr>
+        <w:t xml:space="preserve">psql "$OWNER_URL" -v ON_ERROR_STOP=1 -f 0020_transactional_credential.sql</w:t>
+      </w:r>
+    </w:p>
+    <w:p>
+      <w:pPr>
+        <w:keepLines/>
+        <w:pBdr>
+          <w:left w:val="single" w:color="2753E4" w:sz="12" w:space="6"/>
+        </w:pBdr>
+        <w:shd w:fill="F3F4F6" w:val="clear"/>
         <w:spacing w:after="160" w:before="0" w:line="250"/>
         <w:ind w:left="120" w:right="120"/>
       </w:pPr>
@@ -4443,7 +4445,7 @@
           <w:sz w:val="17"/>
           <w:szCs w:val="17"/>
         </w:rPr>
-        <w:t xml:space="preserve">psql "$OWNER_URL" -v ON_ERROR_STOP=1 -f 0020_transactional_credential.sql</w:t>
+        <w:t xml:space="preserve">psql "$OWNER_URL" -v ON_ERROR_STOP=1 -f 0021_webhook_event_dedupe.sql</w:t>
       </w:r>
     </w:p>
     <w:p>
@@ -4514,7 +4516,26 @@
           <w:sz w:val="21"/>
           <w:szCs w:val="21"/>
         </w:rPr>
-        <w:t xml:space="preserve"> — one row after 0020.</w:t>
+        <w:t xml:space="preserve"> — one row after 0020; </w:t>
+      </w:r>
+      <w:r>
+        <w:rPr>
+          <w:rFonts w:ascii="Consolas" w:cs="Consolas" w:eastAsia="Consolas" w:hAnsi="Consolas"/>
+          <w:color w:val="0F172A"/>
+          <w:sz w:val="19"/>
+          <w:szCs w:val="19"/>
+          <w:shd w:fill="EEF2F7" w:val="clear"/>
+        </w:rPr>
+        <w:t xml:space="preserve">select column_name from information_schema.columns where table_name = 'delivery_webhook_event' and column_name = 'provider_event_id';</w:t>
+      </w:r>
+      <w:r>
+        <w:rPr>
+          <w:rFonts w:ascii="Calibri" w:cs="Calibri" w:eastAsia="Calibri" w:hAnsi="Calibri"/>
+          <w:color w:val="1F2937"/>
+          <w:sz w:val="21"/>
+          <w:szCs w:val="21"/>
+        </w:rPr>
+        <w:t xml:space="preserve"> — one row after 0021.</w:t>
       </w:r>
     </w:p>
     <w:p>

</xml_diff>

<commit_message>
A scheduler for a server without a broker: campaign runs, list imports and every scheduled job in one process
`manage.py run_scheduler` does what the Celery worker and beat would on a box with no Redis: each pass starts, sends
and closes campaign runs that are due, processes uploaded list files, and runs every job of CELERY_BEAT_SCHEDULE whose
interval has passed since its last success, recorded in job_run as a Celery run would be. The outbox relay is left out
(it publishes to Redis streams). deploy/cep-jobs.service is the user-level unit for it, beside cep-backend and
cep-frontend on the dev server; never next to cep-worker and cep-beat.

Found by its first pass: the activity entry of a run that cannot start ("Send could not start: ...") was written
outside a tenant transaction and refused by the row-level policy, on the worker path too. runs._activity now holds one.

Deployment guide v1.12: section 7 "Without a broker".

Co-Authored-By: Claude Fable 5.1 <noreply@anthropic.com>
</commit_message>
<xml_diff>
--- a/docs/CEP_Deployment_Guide.docx
+++ b/docs/CEP_Deployment_Guide.docx
@@ -43,7 +43,7 @@
           <w:sz w:val="21"/>
           <w:szCs w:val="21"/>
         </w:rPr>
-        <w:t xml:space="preserve">Version 1.11  ·  26 September 2026  ·  Repository: github.com/Git-aiintelekt/CEP (branch main)</w:t>
+        <w:t xml:space="preserve">Version 1.12  ·  26 September 2026  ·  Repository: github.com/Git-aiintelekt/CEP (branch main)</w:t>
       </w:r>
     </w:p>
     <w:p>
@@ -156,7 +156,45 @@
           <w:sz w:val="21"/>
           <w:szCs w:val="21"/>
         </w:rPr>
-        <w:t xml:space="preserve">v1.11 adds </w:t>
+        <w:t xml:space="preserve">v1.12 adds </w:t>
+      </w:r>
+      <w:r>
+        <w:rPr>
+          <w:rFonts w:ascii="Consolas" w:cs="Consolas" w:eastAsia="Consolas" w:hAnsi="Consolas"/>
+          <w:color w:val="0F172A"/>
+          <w:sz w:val="19"/>
+          <w:szCs w:val="19"/>
+          <w:shd w:fill="EEF2F7" w:val="clear"/>
+        </w:rPr>
+        <w:t xml:space="preserve">manage.py run_scheduler</w:t>
+      </w:r>
+      <w:r>
+        <w:rPr>
+          <w:rFonts w:ascii="Calibri" w:cs="Calibri" w:eastAsia="Calibri" w:hAnsi="Calibri"/>
+          <w:color w:val="1F2937"/>
+          <w:sz w:val="21"/>
+          <w:szCs w:val="21"/>
+        </w:rPr>
+        <w:t xml:space="preserve"> and the user-level unit </w:t>
+      </w:r>
+      <w:r>
+        <w:rPr>
+          <w:rFonts w:ascii="Consolas" w:cs="Consolas" w:eastAsia="Consolas" w:hAnsi="Consolas"/>
+          <w:color w:val="0F172A"/>
+          <w:sz w:val="19"/>
+          <w:szCs w:val="19"/>
+          <w:shd w:fill="EEF2F7" w:val="clear"/>
+        </w:rPr>
+        <w:t xml:space="preserve">deploy/cep-jobs.service</w:t>
+      </w:r>
+      <w:r>
+        <w:rPr>
+          <w:rFonts w:ascii="Calibri" w:cs="Calibri" w:eastAsia="Calibri" w:hAnsi="Calibri"/>
+          <w:color w:val="1F2937"/>
+          <w:sz w:val="21"/>
+          <w:szCs w:val="21"/>
+        </w:rPr>
+        <w:t xml:space="preserve">: on a server without Redis (the dev server) one process now does what the Celery worker and beat would — campaign sends, list imports and every scheduled job on its interval — so nothing has to be run by hand there any more (section 7, "Without a broker"). It also fixes an activity-log write on a failed run start that the row-level policy refused. v1.11 adds </w:t>
       </w:r>
       <w:r>
         <w:rPr>
@@ -8120,6 +8158,269 @@
           <w:szCs w:val="17"/>
         </w:rPr>
         <w:t xml:space="preserve">curl -s http://127.0.0.1:8000/healthz -H "X-Forwarded-Proto: https"</w:t>
+      </w:r>
+    </w:p>
+    <w:p>
+      <w:pPr>
+        <w:pStyle w:val="Heading2"/>
+        <w:keepNext/>
+        <w:spacing w:after="110" w:before="260"/>
+      </w:pPr>
+      <w:r>
+        <w:rPr>
+          <w:rFonts w:ascii="Calibri" w:cs="Calibri" w:eastAsia="Calibri" w:hAnsi="Calibri"/>
+          <w:b/>
+          <w:bCs/>
+          <w:color w:val="1F2937"/>
+          <w:sz w:val="25"/>
+          <w:szCs w:val="25"/>
+        </w:rPr>
+        <w:t xml:space="preserve">Without a broker (a development server, or one small server without Redis)</w:t>
+      </w:r>
+    </w:p>
+    <w:p>
+      <w:pPr>
+        <w:spacing w:after="120" w:line="288"/>
+      </w:pPr>
+      <w:r>
+        <w:rPr>
+          <w:rFonts w:ascii="Calibri" w:cs="Calibri" w:eastAsia="Calibri" w:hAnsi="Calibri"/>
+          <w:color w:val="1F2937"/>
+          <w:sz w:val="21"/>
+          <w:szCs w:val="21"/>
+        </w:rPr>
+        <w:t xml:space="preserve">Redis and Celery are the production layout. A server that has neither runs one scheduler process instead: </w:t>
+      </w:r>
+      <w:r>
+        <w:rPr>
+          <w:rFonts w:ascii="Consolas" w:cs="Consolas" w:eastAsia="Consolas" w:hAnsi="Consolas"/>
+          <w:color w:val="0F172A"/>
+          <w:sz w:val="19"/>
+          <w:szCs w:val="19"/>
+          <w:shd w:fill="EEF2F7" w:val="clear"/>
+        </w:rPr>
+        <w:t xml:space="preserve">python manage.py run_scheduler</w:t>
+      </w:r>
+      <w:r>
+        <w:rPr>
+          <w:rFonts w:ascii="Calibri" w:cs="Calibri" w:eastAsia="Calibri" w:hAnsi="Calibri"/>
+          <w:color w:val="1F2937"/>
+          <w:sz w:val="21"/>
+          <w:szCs w:val="21"/>
+        </w:rPr>
+        <w:t xml:space="preserve"> starts, sends and closes campaign runs that are due, processes uploaded list files, and runs every job of the Celery beat schedule on its own interval, recorded in </w:t>
+      </w:r>
+      <w:r>
+        <w:rPr>
+          <w:rFonts w:ascii="Consolas" w:cs="Consolas" w:eastAsia="Consolas" w:hAnsi="Consolas"/>
+          <w:color w:val="0F172A"/>
+          <w:sz w:val="19"/>
+          <w:szCs w:val="19"/>
+          <w:shd w:fill="EEF2F7" w:val="clear"/>
+        </w:rPr>
+        <w:t xml:space="preserve">job_run</w:t>
+      </w:r>
+      <w:r>
+        <w:rPr>
+          <w:rFonts w:ascii="Calibri" w:cs="Calibri" w:eastAsia="Calibri" w:hAnsi="Calibri"/>
+          <w:color w:val="1F2937"/>
+          <w:sz w:val="21"/>
+          <w:szCs w:val="21"/>
+        </w:rPr>
+        <w:t xml:space="preserve"> exactly as a Celery run would be, so the health page and the alerts see them. The outbox relay is left out: it publishes to Redis streams. </w:t>
+      </w:r>
+      <w:r>
+        <w:rPr>
+          <w:rFonts w:ascii="Consolas" w:cs="Consolas" w:eastAsia="Consolas" w:hAnsi="Consolas"/>
+          <w:color w:val="0F172A"/>
+          <w:sz w:val="19"/>
+          <w:szCs w:val="19"/>
+          <w:shd w:fill="EEF2F7" w:val="clear"/>
+        </w:rPr>
+        <w:t xml:space="preserve">deploy/cep-jobs.service</w:t>
+      </w:r>
+      <w:r>
+        <w:rPr>
+          <w:rFonts w:ascii="Calibri" w:cs="Calibri" w:eastAsia="Calibri" w:hAnsi="Calibri"/>
+          <w:color w:val="1F2937"/>
+          <w:sz w:val="21"/>
+          <w:szCs w:val="21"/>
+        </w:rPr>
+        <w:t xml:space="preserve"> is a user-level systemd unit for it (edit the two paths, copy to </w:t>
+      </w:r>
+      <w:r>
+        <w:rPr>
+          <w:rFonts w:ascii="Consolas" w:cs="Consolas" w:eastAsia="Consolas" w:hAnsi="Consolas"/>
+          <w:color w:val="0F172A"/>
+          <w:sz w:val="19"/>
+          <w:szCs w:val="19"/>
+          <w:shd w:fill="EEF2F7" w:val="clear"/>
+        </w:rPr>
+        <w:t xml:space="preserve">~/.config/systemd/user/</w:t>
+      </w:r>
+      <w:r>
+        <w:rPr>
+          <w:rFonts w:ascii="Calibri" w:cs="Calibri" w:eastAsia="Calibri" w:hAnsi="Calibri"/>
+          <w:color w:val="1F2937"/>
+          <w:sz w:val="21"/>
+          <w:szCs w:val="21"/>
+        </w:rPr>
+        <w:t xml:space="preserve">, </w:t>
+      </w:r>
+      <w:r>
+        <w:rPr>
+          <w:rFonts w:ascii="Consolas" w:cs="Consolas" w:eastAsia="Consolas" w:hAnsi="Consolas"/>
+          <w:color w:val="0F172A"/>
+          <w:sz w:val="19"/>
+          <w:szCs w:val="19"/>
+          <w:shd w:fill="EEF2F7" w:val="clear"/>
+        </w:rPr>
+        <w:t xml:space="preserve">systemctl --user enable --now cep-jobs</w:t>
+      </w:r>
+      <w:r>
+        <w:rPr>
+          <w:rFonts w:ascii="Calibri" w:cs="Calibri" w:eastAsia="Calibri" w:hAnsi="Calibri"/>
+          <w:color w:val="1F2937"/>
+          <w:sz w:val="21"/>
+          <w:szCs w:val="21"/>
+        </w:rPr>
+        <w:t xml:space="preserve">); the dev server 10.0.0.43 runs it beside </w:t>
+      </w:r>
+      <w:r>
+        <w:rPr>
+          <w:rFonts w:ascii="Consolas" w:cs="Consolas" w:eastAsia="Consolas" w:hAnsi="Consolas"/>
+          <w:color w:val="0F172A"/>
+          <w:sz w:val="19"/>
+          <w:szCs w:val="19"/>
+          <w:shd w:fill="EEF2F7" w:val="clear"/>
+        </w:rPr>
+        <w:t xml:space="preserve">cep-backend</w:t>
+      </w:r>
+      <w:r>
+        <w:rPr>
+          <w:rFonts w:ascii="Calibri" w:cs="Calibri" w:eastAsia="Calibri" w:hAnsi="Calibri"/>
+          <w:color w:val="1F2937"/>
+          <w:sz w:val="21"/>
+          <w:szCs w:val="21"/>
+        </w:rPr>
+        <w:t xml:space="preserve"> and </w:t>
+      </w:r>
+      <w:r>
+        <w:rPr>
+          <w:rFonts w:ascii="Consolas" w:cs="Consolas" w:eastAsia="Consolas" w:hAnsi="Consolas"/>
+          <w:color w:val="0F172A"/>
+          <w:sz w:val="19"/>
+          <w:szCs w:val="19"/>
+          <w:shd w:fill="EEF2F7" w:val="clear"/>
+        </w:rPr>
+        <w:t xml:space="preserve">cep-frontend</w:t>
+      </w:r>
+      <w:r>
+        <w:rPr>
+          <w:rFonts w:ascii="Calibri" w:cs="Calibri" w:eastAsia="Calibri" w:hAnsi="Calibri"/>
+          <w:color w:val="1F2937"/>
+          <w:sz w:val="21"/>
+          <w:szCs w:val="21"/>
+        </w:rPr>
+        <w:t xml:space="preserve">. Never run it next to </w:t>
+      </w:r>
+      <w:r>
+        <w:rPr>
+          <w:rFonts w:ascii="Consolas" w:cs="Consolas" w:eastAsia="Consolas" w:hAnsi="Consolas"/>
+          <w:color w:val="0F172A"/>
+          <w:sz w:val="19"/>
+          <w:szCs w:val="19"/>
+          <w:shd w:fill="EEF2F7" w:val="clear"/>
+        </w:rPr>
+        <w:t xml:space="preserve">cep-worker</w:t>
+      </w:r>
+      <w:r>
+        <w:rPr>
+          <w:rFonts w:ascii="Calibri" w:cs="Calibri" w:eastAsia="Calibri" w:hAnsi="Calibri"/>
+          <w:color w:val="1F2937"/>
+          <w:sz w:val="21"/>
+          <w:szCs w:val="21"/>
+        </w:rPr>
+        <w:t xml:space="preserve"> and </w:t>
+      </w:r>
+      <w:r>
+        <w:rPr>
+          <w:rFonts w:ascii="Consolas" w:cs="Consolas" w:eastAsia="Consolas" w:hAnsi="Consolas"/>
+          <w:color w:val="0F172A"/>
+          <w:sz w:val="19"/>
+          <w:szCs w:val="19"/>
+          <w:shd w:fill="EEF2F7" w:val="clear"/>
+        </w:rPr>
+        <w:t xml:space="preserve">cep-beat</w:t>
+      </w:r>
+      <w:r>
+        <w:rPr>
+          <w:rFonts w:ascii="Calibri" w:cs="Calibri" w:eastAsia="Calibri" w:hAnsi="Calibri"/>
+          <w:color w:val="1F2937"/>
+          <w:sz w:val="21"/>
+          <w:szCs w:val="21"/>
+        </w:rPr>
+        <w:t xml:space="preserve">: the same runs would be processed twice. One process, no parallel batches: for a fleet, install Redis and use the units above.</w:t>
+      </w:r>
+    </w:p>
+    <w:p>
+      <w:pPr>
+        <w:keepLines/>
+        <w:pBdr>
+          <w:left w:val="single" w:color="2753E4" w:sz="12" w:space="6"/>
+        </w:pBdr>
+        <w:shd w:fill="F3F4F6" w:val="clear"/>
+        <w:spacing w:after="0" w:before="40" w:line="250"/>
+        <w:ind w:left="120" w:right="120"/>
+      </w:pPr>
+      <w:r>
+        <w:rPr>
+          <w:rFonts w:ascii="Consolas" w:cs="Consolas" w:eastAsia="Consolas" w:hAnsi="Consolas"/>
+          <w:color w:val="0F172A"/>
+          <w:sz w:val="17"/>
+          <w:szCs w:val="17"/>
+        </w:rPr>
+        <w:t xml:space="preserve">cd /opt/cep/app/backend &amp;&amp; .venv/bin/python manage.py run_scheduler --once     # one pass, to see what is due</w:t>
+      </w:r>
+    </w:p>
+    <w:p>
+      <w:pPr>
+        <w:keepLines/>
+        <w:pBdr>
+          <w:left w:val="single" w:color="2753E4" w:sz="12" w:space="6"/>
+        </w:pBdr>
+        <w:shd w:fill="F3F4F6" w:val="clear"/>
+        <w:spacing w:after="0" w:before="0" w:line="250"/>
+        <w:ind w:left="120" w:right="120"/>
+      </w:pPr>
+      <w:r>
+        <w:rPr>
+          <w:rFonts w:ascii="Consolas" w:cs="Consolas" w:eastAsia="Consolas" w:hAnsi="Consolas"/>
+          <w:color w:val="0F172A"/>
+          <w:sz w:val="17"/>
+          <w:szCs w:val="17"/>
+        </w:rPr>
+        <w:t xml:space="preserve">cp ../deploy/cep-jobs.service ~/.config/systemd/user/cep-jobs.service     # then edit the paths</w:t>
+      </w:r>
+    </w:p>
+    <w:p>
+      <w:pPr>
+        <w:keepLines/>
+        <w:pBdr>
+          <w:left w:val="single" w:color="2753E4" w:sz="12" w:space="6"/>
+        </w:pBdr>
+        <w:shd w:fill="F3F4F6" w:val="clear"/>
+        <w:spacing w:after="160" w:before="0" w:line="250"/>
+        <w:ind w:left="120" w:right="120"/>
+      </w:pPr>
+      <w:r>
+        <w:rPr>
+          <w:rFonts w:ascii="Consolas" w:cs="Consolas" w:eastAsia="Consolas" w:hAnsi="Consolas"/>
+          <w:color w:val="0F172A"/>
+          <w:sz w:val="17"/>
+          <w:szCs w:val="17"/>
+        </w:rPr>
+        <w:t xml:space="preserve">systemctl --user daemon-reload &amp;&amp; systemctl --user enable --now cep-jobs &amp;&amp; systemctl --user status cep-jobs --no-pager</w:t>
       </w:r>
     </w:p>
     <w:p>

</xml_diff>